<commit_message>
docs: record sync pause deployment verification
</commit_message>
<xml_diff>
--- a/jackyun-portal/docs/sync-pause-3.61.0-20261029.docx
+++ b/jackyun-portal/docs/sync-pause-3.61.0-20261029.docx
@@ -327,7 +327,7 @@
         <w:pStyle w:val="ListBullet"/>
       </w:pPr>
       <w:r>
-        <w:t>代码合并到 Main：待完成。</w:t>
+        <w:t>代码合并到 Main：PR #176 已于 2026-10-29 合并，合并提交 8b3065e26330985b7eb67eed653540899e37505a。</w:t>
       </w:r>
     </w:p>
     <w:p>
@@ -335,12 +335,12 @@
         <w:pStyle w:val="ListBullet"/>
       </w:pPr>
       <w:r>
-        <w:t>生产部署及 jackyun.top 实际发布状态：待部署后核验。</w:t>
+        <w:t>生产部署：Vercel dpl_4kBY8sTGj9sWRwAetHwaQ4YZ29LH 状态 READY；部署源码为合并提交 8b3065e26330985b7eb67eed653540899e37505a，别名包含 jackyun.top。</w:t>
       </w:r>
     </w:p>
     <w:p>
       <w:r>
-        <w:t>部署核验将以生产部署状态为 READY、部署源码提交与 Main 合并提交一致、生产别名已绑定为依据。生产构建就绪只证明发布流程成功；本机账号的跨设备实际数据读回仍须按真实账户验收。</w:t>
+        <w:t>部署核验已确认生产状态 READY、部署源码提交与 Main 合并提交一致、生产别名包含 jackyun.top。生产构建就绪只证明发布流程成功；本机账号的跨设备实际数据读回仍须按真实账户验收。DOCX 的页面级视觉渲染尚未完成：此工作区依赖包未提供 LibreOffice 渲染器。</w:t>
       </w:r>
     </w:p>
     <w:sectPr>

</xml_diff>

<commit_message>
docs: record sync pause deployment verification (#177)
Record the merged sync pause feature and its production deployment evidence.
</commit_message>
<xml_diff>
--- a/jackyun-portal/docs/sync-pause-3.61.0-20261029.docx
+++ b/jackyun-portal/docs/sync-pause-3.61.0-20261029.docx
@@ -327,7 +327,7 @@
         <w:pStyle w:val="ListBullet"/>
       </w:pPr>
       <w:r>
-        <w:t>代码合并到 Main：待完成。</w:t>
+        <w:t>代码合并到 Main：PR #176 已于 2026-10-29 合并，合并提交 8b3065e26330985b7eb67eed653540899e37505a。</w:t>
       </w:r>
     </w:p>
     <w:p>
@@ -335,12 +335,12 @@
         <w:pStyle w:val="ListBullet"/>
       </w:pPr>
       <w:r>
-        <w:t>生产部署及 jackyun.top 实际发布状态：待部署后核验。</w:t>
+        <w:t>生产部署：Vercel dpl_4kBY8sTGj9sWRwAetHwaQ4YZ29LH 状态 READY；部署源码为合并提交 8b3065e26330985b7eb67eed653540899e37505a，别名包含 jackyun.top。</w:t>
       </w:r>
     </w:p>
     <w:p>
       <w:r>
-        <w:t>部署核验将以生产部署状态为 READY、部署源码提交与 Main 合并提交一致、生产别名已绑定为依据。生产构建就绪只证明发布流程成功；本机账号的跨设备实际数据读回仍须按真实账户验收。</w:t>
+        <w:t>部署核验已确认生产状态 READY、部署源码提交与 Main 合并提交一致、生产别名包含 jackyun.top。生产构建就绪只证明发布流程成功；本机账号的跨设备实际数据读回仍须按真实账户验收。DOCX 的页面级视觉渲染尚未完成：此工作区依赖包未提供 LibreOffice 渲染器。</w:t>
       </w:r>
     </w:p>
     <w:sectPr>

</xml_diff>